<commit_message>
Harden supplementary package for OPTE submission
</commit_message>
<xml_diff>
--- a/Supplementary_Material.docx
+++ b/Supplementary_Material.docx
@@ -25,19 +25,7 @@
         <w:spacing w:line="480" w:lineRule="auto"/>
       </w:pPr>
       <w:r>
-        <w:t xml:space="preserve">Public repository: </w:t>
-      </w:r>
-      <w:r>
-        <w:t>https://github.com/gabrielmontufar/article-114-optimization-and-engineering-claim-admissibility</w:t>
-      </w:r>
-      <w:r>
-        <w:t xml:space="preserve">. This repository contains this supplementary Word document, the submitted reproducibility archive, and the public-facing README for the article 114 Optimization and Engineering package. Third-party raw datasets are included only when redistribution permission is confirmed; otherwise the repository provides </w:t>
-      </w:r>
-      <w:r>
-        <w:t>processed response-support points</w:t>
-      </w:r>
-      <w:r>
-        <w:t>, manifests, acquisition notes, and acquisition instructions.</w:t>
+        <w:t>Public repository: https://github.com/gabrielmontufar/article-114-optimization-and-engineering-claim-admissibility. This repository contains this supplementary Word document, the submitted reproducibility archive, and the public-facing README for the article 114 Optimization and Engineering package. Third-party raw datasets are not bundled in the submission ZIP; the repository provides processed response-support points, manifests, acquisition notes, and acquisition instructions.</w:t>
       </w:r>
     </w:p>
     <w:p>
@@ -45,7 +33,7 @@
         <w:spacing w:line="480" w:lineRule="auto"/>
       </w:pPr>
       <w:r>
-        <w:t>An Optimizer-Agnostic Certification Layer for Engineering Design Optimization Outputs</w:t>
+        <w:t>Supplementary Material for Optimizer-Agnostic Claim-Admissibility for Discrete Structural Design Optimization Outputs</w:t>
       </w:r>
     </w:p>
     <w:p>
@@ -1737,7 +1725,7 @@
         <w:spacing w:line="480" w:lineRule="auto"/>
       </w:pPr>
       <w:r>
-        <w:t>The files cgc_portal_frame_published_test_register.csv, cgc_portal_frame_experimental_response.csv, cgc_portal_frame_response_support.py, cgc_portal_frame_response_support_summary.csv, cgc_portal_frame_response_support_details.csv, cgc_response_support_threshold_sensitivity.csv, cgc_portal_frame_raw_data_manifest.csv, and cgc_portal_frame_raw_data_acquisition_note.md add a limited published-response support layer. The raw DesignSafe/NEES SAC Steel Project Experiment 5 files are stored outside the submission ZIP in the local/Drive raw-data folder, while the processed service-envelope points are included in the ZIP. The script screens ten raw cyclic response curves, accepts seven specimens under the declared service-response and initial-stiffness tolerances, logs three failed or insufficient cases, and reports false_certified_count = 0. The sensitivity table reports how the passing count changes under NRMSE limits 0.10/0.15/0.20 and stiffness-error limits 0.15/0.20/0.25. The resulting response_support_status is supported_by_processed_published_response_data for the tested steel-frame response family only; it is not safety certification, AISC approval, professional certification, or complete regulatory approval.</w:t>
+        <w:t>The files cgc_portal_frame_published_test_register.csv, cgc_portal_frame_experimental_response.csv, cgc_portal_frame_response_support.py, cgc_portal_frame_response_support_summary.csv, cgc_portal_frame_response_support_details.csv, cgc_response_support_threshold_sensitivity.csv, cgc_portal_frame_raw_data_manifest.csv, and cgc_portal_frame_raw_data_acquisition_note.md add a limited published-response support layer. The raw DesignSafe/NEES SAC Steel Project Experiment 5 files are not bundled in the submission ZIP; acquisition instructions are provided, while the processed service-envelope points are included in the ZIP. The script screens ten raw cyclic response curves, accepts seven specimens under the declared service-response and initial-stiffness tolerances, logs three failed or insufficient cases, and reports false_certified_count = 0. The sensitivity table reports how the passing count changes under NRMSE limits 0.10/0.15/0.20 and stiffness-error limits 0.15/0.20/0.25. The resulting response_support_status is supported_by_processed_published_response_data for the tested steel-frame response family only; it is not safety certification, AISC approval, professional certification, or complete regulatory approval.</w:t>
       </w:r>
     </w:p>
     <w:p>
@@ -1761,7 +1749,7 @@
           <w:sz w:val="22"/>
           <w:szCs w:val="22"/>
         </w:rPr>
-        <w:t>The files cgc_truss_published_test_register.csv, cgc_truss_experimental_response.csv, cgc_truss_response_support.py, cgc_truss_response_support_summary.csv, cgc_truss_response_support_details.csv, cgc_response_support_threshold_sensitivity.csv, cgc_truss_raw_data_manifest.csv, and cgc_truss_raw_data_acquisition_note.md add a limited published truss published-response support layer. The raw Zenodo workbook 10.5281/zenodo.15658671 is included inside the submission ZIP under external_raw_datasets/Zenodo_15658671_SteelTruss/ because it is distributed under Creative Commons Attribution 4.0 International. The module screens seven truss damage/collapse cases against intact-state sensor baselines, accepts six under the declared detection rule, logs one discrepancy, and reports false_certified_count = 0. The sensitivity table reports the passing count under detection-rate limits 0.45/0.50/0.55.</w:t>
+        <w:t>The files cgc_truss_published_test_register.csv, cgc_truss_experimental_response.csv, cgc_truss_response_support.py, cgc_truss_response_support_summary.csv, cgc_truss_response_support_details.csv, cgc_response_support_threshold_sensitivity.csv, cgc_truss_raw_data_manifest.csv, and cgc_truss_raw_data_acquisition_note.md add a limited published truss published-response support layer. The public Zenodo workbook 10.5281/zenodo.15658671 is not bundled in the submission ZIP; the ZIP provides processed response points, a manifest, and acquisition instructions for optional raw-data reruns. The module screens seven truss damage/collapse cases against intact-state sensor baselines, accepts six under the declared detection rule, logs one discrepancy, and reports false_certified_count = 0. The sensitivity table reports the passing count under detection-rate limits 0.45/0.50/0.55.</w:t>
       </w:r>
     </w:p>
     <w:p>
@@ -1819,7 +1807,7 @@
         <w:spacing w:line="480" w:lineRule="auto"/>
       </w:pPr>
       <w:r>
-        <w:t>The files cgc_software_package_integrity.py, cgc_software_package_integrity_details.csv, cgc_software_package_integrity_summary.csv, and cgc_software_package_integrity_note.txt check the reproducibility package across presentation, application, data, and integration layers. The checker compiles package Python scripts, checks required entry points, verifies critical CSV schemas and processed datasets, confirms ZIP exclusions and upload-package hash consistency, and writes software_package_integrity_status back to cgc_benchmark_reporting_summary.csv. A passed result authorizes only software-package integrity of the reproducibility package; it is not structural-code approval, professional approval, legal approval, or complete regulatory approval. The checker also confirms that the redistributable Zenodo raw workbook, response-support threshold-sensitivity table, AISC traceability table, and vendored PuLP/CBC license note are present when the full package is checked.</w:t>
+        <w:t>The files cgc_software_package_integrity.py, cgc_software_package_integrity_details.csv, cgc_software_package_integrity_summary.csv, and cgc_software_package_integrity_note.txt check the reproducibility package across presentation, application, data, and integration layers. The checker compiles package Python scripts, checks required entry points, verifies critical CSV schemas and processed datasets, confirms ZIP exclusions and upload-package hash consistency, and writes software_package_integrity_status back to cgc_benchmark_reporting_summary.csv. A passed result authorizes only software-package integrity of the reproducibility package; it is not structural-code approval, professional approval, legal approval, or complete regulatory approval. The checker also confirms that processed response-support points, response-support threshold-sensitivity tables, AISC traceability outputs, acquisition notes for nonbundled raw sources, and package dependency instructions are present when the full package is checked.</w:t>
       </w:r>
     </w:p>
     <w:p>
@@ -1827,7 +1815,7 @@
         <w:spacing w:line="480" w:lineRule="auto"/>
       </w:pPr>
       <w:r>
-        <w:t>Third-party raw-data redistribution note. The file third_party_raw_data_redistribution_note.md summarizes why some third-party raw datasets are included while others are not. The Zenodo truss workbook is redistributed because the source record declares CC BY 4.0 licensing. The DesignSafe/NEES portal-frame raw files and the AISC Shapes Database spreadsheet are not redistributed because open redistribution permission was not confirmed for those third-party resources; the package therefore includes processed response-support points, source manifests, acquisition notes, AISC source/output checksums, and rerun instructions instead.</w:t>
+        <w:t>Third-party raw-data redistribution note. The file third_party_raw_data_redistribution_note.md summarizes the package boundary for third-party raw sources. The Zenodo truss workbook is public and citable, but it is not bundled in the submission ZIP; reviewers can obtain it from the public Zenodo record for optional raw-data reruns. The DesignSafe/NEES portal-frame raw files and the AISC Shapes Database spreadsheet are also not redistributed in the submission ZIP. The package therefore includes processed response-support points, source manifests, acquisition notes, AISC source/output checksums, and rerun instructions instead.</w:t>
       </w:r>
     </w:p>
     <w:p>
@@ -13846,7 +13834,7 @@
 </file>
 
 <file path=customXml/itemProps1.xml><?xml version="1.0" encoding="utf-8"?>
-<ds:datastoreItem xmlns:ds="http://schemas.openxmlformats.org/officeDocument/2006/customXml" ds:itemID="{024F3889-A5DA-49D9-BD27-A4CFD48BC69C}">
+<ds:datastoreItem xmlns:ds="http://schemas.openxmlformats.org/officeDocument/2006/customXml" ds:itemID="{B394010D-D640-48E2-9E1A-39399CEB31F6}">
   <ds:schemaRefs>
     <ds:schemaRef ds:uri="http://schemas.openxmlformats.org/officeDocument/2006/bibliography"/>
   </ds:schemaRefs>

</xml_diff>